<commit_message>
feat(khbd): chuan hoa toan bo KHBD Tin hoc & Robotics theo Tuan, PL4 va quy chuan vien bang
</commit_message>
<xml_diff>
--- a/Hệ thống mẫu văn bản/PL4-Khung kế hoạch bài dạy (THCS).docx
+++ b/Hệ thống mẫu văn bản/PL4-Khung kế hoạch bài dạy (THCS).docx
@@ -131,7 +131,15 @@
                 <w:sz w:val="26"/>
                 <w:szCs w:val="26"/>
               </w:rPr>
-              <w:t xml:space="preserve"> Tin học</w:t>
+              <w:t xml:space="preserve"> </w:t>
+            </w:r>
+            <w:r>
+              <w:rPr>
+                <w:rFonts w:ascii="Times New Roman" w:eastAsia="Times New Roman" w:hAnsi="Times New Roman" w:cs="Times New Roman"/>
+                <w:sz w:val="26"/>
+                <w:szCs w:val="26"/>
+              </w:rPr>
+              <w:t>Trung học cơ sở</w:t>
             </w:r>
           </w:p>
         </w:tc>
@@ -168,6 +176,7 @@
             <w:pPr>
               <w:rPr>
                 <w:rFonts w:ascii="Times New Roman" w:eastAsia="Times New Roman" w:hAnsi="Times New Roman" w:cs="Times New Roman"/>
+                <w:color w:val="000000"/>
                 <w:sz w:val="26"/>
                 <w:szCs w:val="26"/>
               </w:rPr>
@@ -191,22 +200,8 @@
           </w:p>
           <w:p>
             <w:pPr>
-              <w:numPr>
-                <w:ilvl w:val="0"/>
-                <w:numId w:val="1"/>
-              </w:numPr>
-              <w:pBdr>
-                <w:top w:val="nil"/>
-                <w:left w:val="nil"/>
-                <w:bottom w:val="nil"/>
-                <w:right w:val="nil"/>
-                <w:between w:val="nil"/>
-              </w:pBdr>
-              <w:spacing w:line="324" w:lineRule="auto"/>
-              <w:jc w:val="both"/>
-              <w:rPr>
-                <w:rFonts w:ascii="Times New Roman" w:eastAsia="Times New Roman" w:hAnsi="Times New Roman" w:cs="Times New Roman"/>
-                <w:color w:val="000000"/>
+              <w:rPr>
+                <w:rFonts w:ascii="Times New Roman" w:eastAsia="Times New Roman" w:hAnsi="Times New Roman" w:cs="Times New Roman"/>
                 <w:sz w:val="26"/>
                 <w:szCs w:val="26"/>
               </w:rPr>
@@ -218,45 +213,12 @@
                 <w:sz w:val="26"/>
                 <w:szCs w:val="26"/>
               </w:rPr>
-              <w:t xml:space="preserve">Lớp </w:t>
-            </w:r>
-          </w:p>
-          <w:p>
-            <w:pPr>
-              <w:numPr>
-                <w:ilvl w:val="0"/>
-                <w:numId w:val="1"/>
-              </w:numPr>
-              <w:pBdr>
-                <w:top w:val="nil"/>
-                <w:left w:val="nil"/>
-                <w:bottom w:val="nil"/>
-                <w:right w:val="nil"/>
-                <w:between w:val="nil"/>
-              </w:pBdr>
-              <w:spacing w:after="120" w:line="324" w:lineRule="auto"/>
-              <w:jc w:val="both"/>
-              <w:rPr>
-                <w:rFonts w:ascii="Times New Roman" w:eastAsia="Times New Roman" w:hAnsi="Times New Roman" w:cs="Times New Roman"/>
-                <w:color w:val="000000"/>
-                <w:sz w:val="26"/>
-                <w:szCs w:val="26"/>
-              </w:rPr>
-            </w:pPr>
-            <w:r>
-              <w:rPr>
-                <w:rFonts w:ascii="Times New Roman" w:eastAsia="Times New Roman" w:hAnsi="Times New Roman" w:cs="Times New Roman"/>
-                <w:color w:val="000000"/>
-                <w:sz w:val="26"/>
-                <w:szCs w:val="26"/>
-              </w:rPr>
-              <w:t xml:space="preserve">Lớp </w:t>
+              <w:t xml:space="preserve">Lớp: </w:t>
             </w:r>
           </w:p>
         </w:tc>
       </w:tr>
     </w:tbl>
-    <w:p/>
     <w:p>
       <w:pPr>
         <w:spacing w:line="276" w:lineRule="auto"/>
@@ -443,6 +405,13 @@
         </w:rPr>
         <w:t>- Năng lực đặc thù</w:t>
       </w:r>
+      <w:r>
+        <w:rPr>
+          <w:b/>
+          <w:bCs/>
+        </w:rPr>
+        <w:t>:</w:t>
+      </w:r>
     </w:p>
     <w:p>
       <w:pPr>
@@ -460,6 +429,13 @@
         </w:rPr>
         <w:t>- Năng lực số</w:t>
       </w:r>
+      <w:r>
+        <w:rPr>
+          <w:b/>
+          <w:bCs/>
+        </w:rPr>
+        <w:t>:</w:t>
+      </w:r>
     </w:p>
     <w:p>
       <w:pPr>
@@ -579,7 +555,6 @@
           <w:i/>
           <w:iCs/>
         </w:rPr>
-        <w:lastRenderedPageBreak/>
         <w:t xml:space="preserve">a) Mục tiêu: </w:t>
       </w:r>
       <w:r>
@@ -599,7 +574,11 @@
         <w:t xml:space="preserve">b) Nội dung: </w:t>
       </w:r>
       <w:r>
-        <w:t>Nêu rõ nội dung yêu cầu/nhiệm vụ cụ thể mà học sinh phải thực hiện (xử lý tình huống, câu hỏi, bài tập, thí nghiệm, thực hành,..) để xác định vấn đề cần giải quyết/nhiệm vụ học tập cần thực hiện và đề xuất giải pháp giải quyết vấn đề/cách thức thực hiện nhiệm vụ.</w:t>
+        <w:t xml:space="preserve">Nêu rõ nội dung yêu cầu/nhiệm vụ cụ thể mà học sinh phải thực hiện (xử lý tình huống, câu hỏi, bài tập, thí nghiệm, thực hành,..) để xác định vấn đề cần giải quyết/nhiệm </w:t>
+      </w:r>
+      <w:r>
+        <w:lastRenderedPageBreak/>
+        <w:t>vụ học tập cần thực hiện và đề xuất giải pháp giải quyết vấn đề/cách thức thực hiện nhiệm vụ.</w:t>
       </w:r>
     </w:p>
     <w:p>
@@ -1142,7 +1121,6 @@
                 <w:sz w:val="26"/>
                 <w:szCs w:val="26"/>
               </w:rPr>
-              <w:lastRenderedPageBreak/>
               <w:t>Bước 4. Đánh giá kết quả thực hiện nhiệm vụ</w:t>
             </w:r>
           </w:p>
@@ -1170,7 +1148,6 @@
                 <w:sz w:val="26"/>
                 <w:szCs w:val="26"/>
               </w:rPr>
-              <w:lastRenderedPageBreak/>
               <w:t xml:space="preserve">I. </w:t>
             </w:r>
           </w:p>
@@ -1282,6 +1259,7 @@
           <w:b/>
           <w:bCs/>
         </w:rPr>
+        <w:lastRenderedPageBreak/>
         <w:t>d. Tổ chức thực hiện</w:t>
       </w:r>
     </w:p>
@@ -1524,20 +1502,62 @@
     </w:p>
     <w:p>
       <w:pPr>
-        <w:jc w:val="center"/>
-        <w:rPr>
-          <w:b/>
-          <w:bCs/>
-          <w:color w:val="FF0000"/>
-        </w:rPr>
-      </w:pPr>
-      <w:r>
-        <w:rPr>
-          <w:b/>
-          <w:bCs/>
-          <w:color w:val="FF0000"/>
-        </w:rPr>
-        <w:t>Lưu ý: Sau 1 tuần mới để phần kí</w:t>
+        <w:rPr>
+          <w:b/>
+          <w:bCs/>
+        </w:rPr>
+      </w:pPr>
+      <w:r>
+        <w:rPr>
+          <w:b/>
+          <w:bCs/>
+        </w:rPr>
+        <w:t>….……………………………………………………………………………………………..</w:t>
+      </w:r>
+    </w:p>
+    <w:p>
+      <w:pPr>
+        <w:rPr>
+          <w:b/>
+          <w:bCs/>
+        </w:rPr>
+      </w:pPr>
+      <w:r>
+        <w:rPr>
+          <w:b/>
+          <w:bCs/>
+        </w:rPr>
+        <w:t>….……………………………………………………………………………………………..</w:t>
+      </w:r>
+    </w:p>
+    <w:p>
+      <w:pPr>
+        <w:rPr>
+          <w:b/>
+          <w:bCs/>
+        </w:rPr>
+      </w:pPr>
+      <w:r>
+        <w:rPr>
+          <w:b/>
+          <w:bCs/>
+        </w:rPr>
+        <w:t>….……………………………………………………………………………………………..</w:t>
+      </w:r>
+    </w:p>
+    <w:p>
+      <w:pPr>
+        <w:rPr>
+          <w:b/>
+          <w:bCs/>
+        </w:rPr>
+      </w:pPr>
+      <w:r>
+        <w:rPr>
+          <w:b/>
+          <w:bCs/>
+        </w:rPr>
+        <w:t>….……………………………………………………………………………………………..</w:t>
       </w:r>
     </w:p>
     <w:tbl>

</xml_diff>